<commit_message>
Foreground AI in Hengqin and store projects
Hengqin: OCR + LLM evidence ledger, AI policy search, AI-built decision
model, agent workspace. Store: video-frame site survey, AI-assisted
layout/branding, Codex workspace, result line.

Co-Authored-By: Claude Opus 5.5 <noreply@anthropic.com>
Claude-Session: https://claude.ai/code/session_01Wy6QccTAXhM16qGGvDf8g9
</commit_message>
<xml_diff>
--- a/resume/fde/邹志华_AI解决方案_NUS硕士_27届.docx
+++ b/resume/fde/邹志华_AI解决方案_NUS硕士_27届.docx
@@ -297,7 +297,7 @@
         </w:rPr>
         <w:t xml:space="preserve"> </w:t>
       </w:r>
-      <w:hyperlink w:history="1" r:id="rId6wwu0-fn20jkbhdvthnat">
+      <w:hyperlink w:history="1" r:id="rIdbykpeba0jggso2mmncv-e">
         <w:r>
           <w:rPr>
             <w:rFonts w:ascii="Times New Roman" w:cs="Times New Roman" w:eastAsia="Microsoft YaHei" w:hAnsi="Times New Roman"/>
@@ -1292,7 +1292,7 @@
           <w:sz w:val="19"/>
           <w:szCs w:val="19"/>
         </w:rPr>
-        <w:t xml:space="preserve">，写清流程、规则边界与验收口径，跟进评审与联调。</w:t>
+        <w:t xml:space="preserve">，写清边界与验收口径。</w:t>
       </w:r>
     </w:p>
     <w:p>
@@ -2879,7 +2879,7 @@
         </w:rPr>
         <w:t xml:space="preserve">	</w:t>
       </w:r>
-      <w:hyperlink w:history="1" r:id="rIdul8ttxbgzuugiciht6c6q">
+      <w:hyperlink w:history="1" r:id="rIdlw2uo2qoxjsysys3ctdbp">
         <w:r>
           <w:rPr>
             <w:rFonts w:ascii="Times New Roman" w:cs="Times New Roman" w:eastAsia="Microsoft YaHei" w:hAnsi="Times New Roman"/>
@@ -3307,33 +3307,33 @@
           <w:sz w:val="19"/>
           <w:szCs w:val="19"/>
         </w:rPr>
-        <w:t xml:space="preserve">（Cognito、API Gateway、Lambda、DynamoDB、SES、CloudFront，自有域名 HTTPS），</w:t>
-      </w:r>
-      <w:r>
-        <w:rPr>
-          <w:rFonts w:ascii="Times New Roman" w:cs="Times New Roman" w:eastAsia="Microsoft YaHei" w:hAnsi="Times New Roman"/>
-          <w:b/>
-          <w:bCs/>
-          <w:i w:val="false"/>
-          <w:iCs w:val="false"/>
-          <w:color w:val="151515"/>
-          <w:sz w:val="19"/>
-          <w:szCs w:val="19"/>
-        </w:rPr>
-        <w:t xml:space="preserve">3 年 TCO 比本地部署低 45%</w:t>
-      </w:r>
-      <w:r>
-        <w:rPr>
-          <w:rFonts w:ascii="Times New Roman" w:cs="Times New Roman" w:eastAsia="Microsoft YaHei" w:hAnsi="Times New Roman"/>
-          <w:b w:val="false"/>
-          <w:bCs w:val="false"/>
-          <w:i w:val="false"/>
-          <w:iCs w:val="false"/>
-          <w:color w:val="151515"/>
-          <w:sz w:val="19"/>
-          <w:szCs w:val="19"/>
-        </w:rPr>
-        <w:t xml:space="preserve">；6 周监控核心接口均值 </w:t>
+        <w:t xml:space="preserve">，</w:t>
+      </w:r>
+      <w:r>
+        <w:rPr>
+          <w:rFonts w:ascii="Times New Roman" w:cs="Times New Roman" w:eastAsia="Microsoft YaHei" w:hAnsi="Times New Roman"/>
+          <w:b/>
+          <w:bCs/>
+          <w:i w:val="false"/>
+          <w:iCs w:val="false"/>
+          <w:color w:val="151515"/>
+          <w:sz w:val="19"/>
+          <w:szCs w:val="19"/>
+        </w:rPr>
+        <w:t xml:space="preserve">3 年 TCO 低 45%</w:t>
+      </w:r>
+      <w:r>
+        <w:rPr>
+          <w:rFonts w:ascii="Times New Roman" w:cs="Times New Roman" w:eastAsia="Microsoft YaHei" w:hAnsi="Times New Roman"/>
+          <w:b w:val="false"/>
+          <w:bCs w:val="false"/>
+          <w:i w:val="false"/>
+          <w:iCs w:val="false"/>
+          <w:color w:val="151515"/>
+          <w:sz w:val="19"/>
+          <w:szCs w:val="19"/>
+        </w:rPr>
+        <w:t xml:space="preserve">；6 周监控接口均值 </w:t>
       </w:r>
       <w:r>
         <w:rPr>
@@ -3359,7 +3359,7 @@
           <w:sz w:val="19"/>
           <w:szCs w:val="19"/>
         </w:rPr>
-        <w:t xml:space="preserve">、223 次调用</w:t>
+        <w:t xml:space="preserve">、</w:t>
       </w:r>
       <w:r>
         <w:rPr>
@@ -3672,7 +3672,7 @@
           <w:sz w:val="20"/>
           <w:szCs w:val="20"/>
         </w:rPr>
-        <w:t xml:space="preserve">产业资产盘活方案</w:t>
+        <w:t xml:space="preserve">AI 驱动的资产尽调与盘活</w:t>
       </w:r>
       <w:r>
         <w:rPr>
@@ -3698,7 +3698,7 @@
           <w:sz w:val="20"/>
           <w:szCs w:val="20"/>
         </w:rPr>
-        <w:t xml:space="preserve">需求澄清 </w:t>
+        <w:t xml:space="preserve">LLM 证据抽取 </w:t>
       </w:r>
       <w:r>
         <w:rPr>
@@ -3724,7 +3724,7 @@
           <w:sz w:val="20"/>
           <w:szCs w:val="20"/>
         </w:rPr>
-        <w:t xml:space="preserve"> 证据建模 </w:t>
+        <w:t xml:space="preserve"> 法规检索 </w:t>
       </w:r>
       <w:r>
         <w:rPr>
@@ -3750,7 +3750,7 @@
           <w:sz w:val="20"/>
           <w:szCs w:val="20"/>
         </w:rPr>
-        <w:t xml:space="preserve"> 路径比选 </w:t>
+        <w:t xml:space="preserve"> 决策建模 </w:t>
       </w:r>
       <w:r>
         <w:rPr>
@@ -3776,7 +3776,7 @@
           <w:sz w:val="20"/>
           <w:szCs w:val="20"/>
         </w:rPr>
-        <w:t xml:space="preserve"> 推进落地</w:t>
+        <w:t xml:space="preserve"> Agent 推进</w:t>
       </w:r>
     </w:p>
     <w:p>
@@ -3838,7 +3838,7 @@
           <w:sz w:val="19"/>
           <w:szCs w:val="19"/>
         </w:rPr>
-        <w:t xml:space="preserve"> 产业厂房年租金约 </w:t>
+        <w:t xml:space="preserve"> 厂房年租金约 </w:t>
       </w:r>
       <w:r>
         <w:rPr>
@@ -3890,59 +3890,7 @@
           <w:sz w:val="19"/>
           <w:szCs w:val="19"/>
         </w:rPr>
-        <w:t xml:space="preserve">，但权属材料分散、历史出资与签约主体不一致，</w:t>
-      </w:r>
-      <w:r>
-        <w:rPr>
-          <w:rFonts w:ascii="Times New Roman" w:cs="Times New Roman" w:eastAsia="Times New Roman" w:hAnsi="Times New Roman"/>
-          <w:b w:val="false"/>
-          <w:bCs w:val="false"/>
-          <w:i w:val="false"/>
-          <w:iCs w:val="false"/>
-          <w:color w:val="151515"/>
-          <w:sz w:val="19"/>
-          <w:szCs w:val="19"/>
-        </w:rPr>
-        <w:t xml:space="preserve">“</w:t>
-      </w:r>
-      <w:r>
-        <w:rPr>
-          <w:rFonts w:ascii="Times New Roman" w:cs="Times New Roman" w:eastAsia="Microsoft YaHei" w:hAnsi="Times New Roman"/>
-          <w:b w:val="false"/>
-          <w:bCs w:val="false"/>
-          <w:i w:val="false"/>
-          <w:iCs w:val="false"/>
-          <w:color w:val="151515"/>
-          <w:sz w:val="19"/>
-          <w:szCs w:val="19"/>
-        </w:rPr>
-        <w:t xml:space="preserve">继续运营还是出售</w:t>
-      </w:r>
-      <w:r>
-        <w:rPr>
-          <w:rFonts w:ascii="Times New Roman" w:cs="Times New Roman" w:eastAsia="Times New Roman" w:hAnsi="Times New Roman"/>
-          <w:b w:val="false"/>
-          <w:bCs w:val="false"/>
-          <w:i w:val="false"/>
-          <w:iCs w:val="false"/>
-          <w:color w:val="151515"/>
-          <w:sz w:val="19"/>
-          <w:szCs w:val="19"/>
-        </w:rPr>
-        <w:t xml:space="preserve">”</w:t>
-      </w:r>
-      <w:r>
-        <w:rPr>
-          <w:rFonts w:ascii="Times New Roman" w:cs="Times New Roman" w:eastAsia="Microsoft YaHei" w:hAnsi="Times New Roman"/>
-          <w:b w:val="false"/>
-          <w:bCs w:val="false"/>
-          <w:i w:val="false"/>
-          <w:iCs w:val="false"/>
-          <w:color w:val="151515"/>
-          <w:sz w:val="19"/>
-          <w:szCs w:val="19"/>
-        </w:rPr>
-        <w:t xml:space="preserve">长期悬而未决；目标是形成可执行的盘活方案。</w:t>
+        <w:t xml:space="preserve">，但权属材料分散、出资与签约主体不一致，运营还是出售久拖未决。</w:t>
       </w:r>
     </w:p>
     <w:p>
@@ -3965,46 +3913,72 @@
           <w:sz w:val="19"/>
           <w:szCs w:val="19"/>
         </w:rPr>
-        <w:t xml:space="preserve">我的职责：</w:t>
-      </w:r>
-      <w:r>
-        <w:rPr>
-          <w:rFonts w:ascii="Times New Roman" w:cs="Times New Roman" w:eastAsia="Microsoft YaHei" w:hAnsi="Times New Roman"/>
-          <w:b w:val="false"/>
-          <w:bCs w:val="false"/>
-          <w:i w:val="false"/>
-          <w:iCs w:val="false"/>
-          <w:color w:val="151515"/>
-          <w:sz w:val="19"/>
-          <w:szCs w:val="19"/>
-        </w:rPr>
-        <w:t xml:space="preserve">对接合作方、村集体、租户及律师/会计师，梳理运营与决策流程、绘制相关方关系图；整合合作建房协议、出资流水与工程付款，建立</w:t>
-      </w:r>
-      <w:r>
-        <w:rPr>
-          <w:rFonts w:ascii="Times New Roman" w:cs="Times New Roman" w:eastAsia="Microsoft YaHei" w:hAnsi="Times New Roman"/>
-          <w:b/>
-          <w:bCs/>
-          <w:i w:val="false"/>
-          <w:iCs w:val="false"/>
-          <w:color w:val="151515"/>
-          <w:sz w:val="19"/>
-          <w:szCs w:val="19"/>
-        </w:rPr>
-        <w:t xml:space="preserve">证据台账与缺口清单</w:t>
-      </w:r>
-      <w:r>
-        <w:rPr>
-          <w:rFonts w:ascii="Times New Roman" w:cs="Times New Roman" w:eastAsia="Microsoft YaHei" w:hAnsi="Times New Roman"/>
-          <w:b w:val="false"/>
-          <w:bCs w:val="false"/>
-          <w:i w:val="false"/>
-          <w:iCs w:val="false"/>
-          <w:color w:val="151515"/>
-          <w:sz w:val="19"/>
-          <w:szCs w:val="19"/>
-        </w:rPr>
-        <w:t xml:space="preserve">。</w:t>
+        <w:t xml:space="preserve">AI 方案：</w:t>
+      </w:r>
+      <w:r>
+        <w:rPr>
+          <w:rFonts w:ascii="Times New Roman" w:cs="Times New Roman" w:eastAsia="Microsoft YaHei" w:hAnsi="Times New Roman"/>
+          <w:b w:val="false"/>
+          <w:bCs w:val="false"/>
+          <w:i w:val="false"/>
+          <w:iCs w:val="false"/>
+          <w:color w:val="151515"/>
+          <w:sz w:val="19"/>
+          <w:szCs w:val="19"/>
+        </w:rPr>
+        <w:t xml:space="preserve">用 </w:t>
+      </w:r>
+      <w:r>
+        <w:rPr>
+          <w:rFonts w:ascii="Times New Roman" w:cs="Times New Roman" w:eastAsia="Microsoft YaHei" w:hAnsi="Times New Roman"/>
+          <w:b/>
+          <w:bCs/>
+          <w:i w:val="false"/>
+          <w:iCs w:val="false"/>
+          <w:color w:val="151515"/>
+          <w:sz w:val="19"/>
+          <w:szCs w:val="19"/>
+        </w:rPr>
+        <w:t xml:space="preserve">OCR + LLM</w:t>
+      </w:r>
+      <w:r>
+        <w:rPr>
+          <w:rFonts w:ascii="Times New Roman" w:cs="Times New Roman" w:eastAsia="Microsoft YaHei" w:hAnsi="Times New Roman"/>
+          <w:b w:val="false"/>
+          <w:bCs w:val="false"/>
+          <w:i w:val="false"/>
+          <w:iCs w:val="false"/>
+          <w:color w:val="151515"/>
+          <w:sz w:val="19"/>
+          <w:szCs w:val="19"/>
+        </w:rPr>
+        <w:t xml:space="preserve"> 从协议、流水、付款与聊天记录抽取关键字段，建成可回溯原件的</w:t>
+      </w:r>
+      <w:r>
+        <w:rPr>
+          <w:rFonts w:ascii="Times New Roman" w:cs="Times New Roman" w:eastAsia="Microsoft YaHei" w:hAnsi="Times New Roman"/>
+          <w:b/>
+          <w:bCs/>
+          <w:i w:val="false"/>
+          <w:iCs w:val="false"/>
+          <w:color w:val="151515"/>
+          <w:sz w:val="19"/>
+          <w:szCs w:val="19"/>
+        </w:rPr>
+        <w:t xml:space="preserve">证据台账</w:t>
+      </w:r>
+      <w:r>
+        <w:rPr>
+          <w:rFonts w:ascii="Times New Roman" w:cs="Times New Roman" w:eastAsia="Microsoft YaHei" w:hAnsi="Times New Roman"/>
+          <w:b w:val="false"/>
+          <w:bCs w:val="false"/>
+          <w:i w:val="false"/>
+          <w:iCs w:val="false"/>
+          <w:color w:val="151515"/>
+          <w:sz w:val="19"/>
+          <w:szCs w:val="19"/>
+        </w:rPr>
+        <w:t xml:space="preserve">；用 AI 检索集体土地、合作建房与横琴政策，形成问题清单交律师核实。</w:t>
       </w:r>
     </w:p>
     <w:p>
@@ -4040,33 +4014,59 @@
           <w:sz w:val="19"/>
           <w:szCs w:val="19"/>
         </w:rPr>
-        <w:t xml:space="preserve">搭建持有运营、主体重组、整体出售三条路径的</w:t>
-      </w:r>
-      <w:r>
-        <w:rPr>
-          <w:rFonts w:ascii="Times New Roman" w:cs="Times New Roman" w:eastAsia="Microsoft YaHei" w:hAnsi="Times New Roman"/>
-          <w:b/>
-          <w:bCs/>
-          <w:i w:val="false"/>
-          <w:iCs w:val="false"/>
-          <w:color w:val="151515"/>
-          <w:sz w:val="19"/>
-          <w:szCs w:val="19"/>
-        </w:rPr>
-        <w:t xml:space="preserve">决策模型</w:t>
-      </w:r>
-      <w:r>
-        <w:rPr>
-          <w:rFonts w:ascii="Times New Roman" w:cs="Times New Roman" w:eastAsia="Microsoft YaHei" w:hAnsi="Times New Roman"/>
-          <w:b w:val="false"/>
-          <w:bCs w:val="false"/>
-          <w:i w:val="false"/>
-          <w:iCs w:val="false"/>
-          <w:color w:val="151515"/>
-          <w:sz w:val="19"/>
-          <w:szCs w:val="19"/>
-        </w:rPr>
-        <w:t xml:space="preserve">（现金流、风险、周期），把法律与财务意见拆成 30/60/90 天任务路线，推动项目从停滞进入材料补全与交易准备。</w:t>
+        <w:t xml:space="preserve">对接村集体、租户与律师/会计师，用 AI 搭建持有、重组、出售</w:t>
+      </w:r>
+      <w:r>
+        <w:rPr>
+          <w:rFonts w:ascii="Times New Roman" w:cs="Times New Roman" w:eastAsia="Microsoft YaHei" w:hAnsi="Times New Roman"/>
+          <w:b/>
+          <w:bCs/>
+          <w:i w:val="false"/>
+          <w:iCs w:val="false"/>
+          <w:color w:val="151515"/>
+          <w:sz w:val="19"/>
+          <w:szCs w:val="19"/>
+        </w:rPr>
+        <w:t xml:space="preserve">三路径决策模型</w:t>
+      </w:r>
+      <w:r>
+        <w:rPr>
+          <w:rFonts w:ascii="Times New Roman" w:cs="Times New Roman" w:eastAsia="Microsoft YaHei" w:hAnsi="Times New Roman"/>
+          <w:b w:val="false"/>
+          <w:bCs w:val="false"/>
+          <w:i w:val="false"/>
+          <w:iCs w:val="false"/>
+          <w:color w:val="151515"/>
+          <w:sz w:val="19"/>
+          <w:szCs w:val="19"/>
+        </w:rPr>
+        <w:t xml:space="preserve">并生成方案报告；以 </w:t>
+      </w:r>
+      <w:r>
+        <w:rPr>
+          <w:rFonts w:ascii="Times New Roman" w:cs="Times New Roman" w:eastAsia="Microsoft YaHei" w:hAnsi="Times New Roman"/>
+          <w:b/>
+          <w:bCs/>
+          <w:i w:val="false"/>
+          <w:iCs w:val="false"/>
+          <w:color w:val="151515"/>
+          <w:sz w:val="19"/>
+          <w:szCs w:val="19"/>
+        </w:rPr>
+        <w:t xml:space="preserve">AI Agent 工作区</w:t>
+      </w:r>
+      <w:r>
+        <w:rPr>
+          <w:rFonts w:ascii="Times New Roman" w:cs="Times New Roman" w:eastAsia="Microsoft YaHei" w:hAnsi="Times New Roman"/>
+          <w:b w:val="false"/>
+          <w:bCs w:val="false"/>
+          <w:i w:val="false"/>
+          <w:iCs w:val="false"/>
+          <w:color w:val="151515"/>
+          <w:sz w:val="19"/>
+          <w:szCs w:val="19"/>
+        </w:rPr>
+        <w:t xml:space="preserve">维护事实基线与 30/60/90 天路线，推动项目进入交易准备。</w:t>
       </w:r>
     </w:p>
     <w:p>
@@ -4162,33 +4162,7 @@
           <w:sz w:val="20"/>
           <w:szCs w:val="20"/>
         </w:rPr>
-        <w:t xml:space="preserve"> 线下门店 0</w:t>
-      </w:r>
-      <w:r>
-        <w:rPr>
-          <w:rFonts w:ascii="Times New Roman" w:cs="Times New Roman" w:eastAsia="Times New Roman" w:hAnsi="Times New Roman"/>
-          <w:b/>
-          <w:bCs/>
-          <w:i w:val="false"/>
-          <w:iCs w:val="false"/>
-          <w:color w:val="151515"/>
-          <w:sz w:val="20"/>
-          <w:szCs w:val="20"/>
-        </w:rPr>
-        <w:t xml:space="preserve">→</w:t>
-      </w:r>
-      <w:r>
-        <w:rPr>
-          <w:rFonts w:ascii="Times New Roman" w:cs="Times New Roman" w:eastAsia="Microsoft YaHei" w:hAnsi="Times New Roman"/>
-          <w:b/>
-          <w:bCs/>
-          <w:i w:val="false"/>
-          <w:iCs w:val="false"/>
-          <w:color w:val="151515"/>
-          <w:sz w:val="20"/>
-          <w:szCs w:val="20"/>
-        </w:rPr>
-        <w:t xml:space="preserve">1 落地</w:t>
+        <w:t xml:space="preserve"> AI 赋能线下门店</w:t>
       </w:r>
       <w:r>
         <w:rPr>
@@ -4304,7 +4278,33 @@
           <w:sz w:val="20"/>
           <w:szCs w:val="20"/>
         </w:rPr>
-        <w:t xml:space="preserve">社区直营小店落地</w:t>
+        <w:t xml:space="preserve">AI 赋能线下门店 0</w:t>
+      </w:r>
+      <w:r>
+        <w:rPr>
+          <w:rFonts w:ascii="Times New Roman" w:cs="Times New Roman" w:eastAsia="Times New Roman" w:hAnsi="Times New Roman"/>
+          <w:b/>
+          <w:bCs/>
+          <w:i w:val="false"/>
+          <w:iCs w:val="false"/>
+          <w:color w:val="244B9B"/>
+          <w:sz w:val="20"/>
+          <w:szCs w:val="20"/>
+        </w:rPr>
+        <w:t xml:space="preserve">→</w:t>
+      </w:r>
+      <w:r>
+        <w:rPr>
+          <w:rFonts w:ascii="Times New Roman" w:cs="Times New Roman" w:eastAsia="Microsoft YaHei" w:hAnsi="Times New Roman"/>
+          <w:b/>
+          <w:bCs/>
+          <w:i w:val="false"/>
+          <w:iCs w:val="false"/>
+          <w:color w:val="244B9B"/>
+          <w:sz w:val="20"/>
+          <w:szCs w:val="20"/>
+        </w:rPr>
+        <w:t xml:space="preserve">1</w:t>
       </w:r>
       <w:r>
         <w:rPr>
@@ -4330,7 +4330,7 @@
           <w:sz w:val="20"/>
           <w:szCs w:val="20"/>
         </w:rPr>
-        <w:t xml:space="preserve">远程勘测 </w:t>
+        <w:t xml:space="preserve">视频抽帧勘测 </w:t>
       </w:r>
       <w:r>
         <w:rPr>
@@ -4356,7 +4356,7 @@
           <w:sz w:val="20"/>
           <w:szCs w:val="20"/>
         </w:rPr>
-        <w:t xml:space="preserve"> 方案设计 </w:t>
+        <w:t xml:space="preserve"> AI 设计 </w:t>
       </w:r>
       <w:r>
         <w:rPr>
@@ -4408,7 +4408,7 @@
           <w:sz w:val="20"/>
           <w:szCs w:val="20"/>
         </w:rPr>
-        <w:t xml:space="preserve"> 试营业数据复盘</w:t>
+        <w:t xml:space="preserve"> 数据复盘</w:t>
       </w:r>
     </w:p>
     <w:p>
@@ -4431,46 +4431,46 @@
           <w:sz w:val="19"/>
           <w:szCs w:val="19"/>
         </w:rPr>
-        <w:t xml:space="preserve">现场诊断与方案：</w:t>
-      </w:r>
-      <w:r>
-        <w:rPr>
-          <w:rFonts w:ascii="Times New Roman" w:cs="Times New Roman" w:eastAsia="Microsoft YaHei" w:hAnsi="Times New Roman"/>
-          <w:b w:val="false"/>
-          <w:bCs w:val="false"/>
-          <w:i w:val="false"/>
-          <w:iCs w:val="false"/>
-          <w:color w:val="151515"/>
-          <w:sz w:val="19"/>
-          <w:szCs w:val="19"/>
-        </w:rPr>
-        <w:t xml:space="preserve">远程看现场视频、复尺定动线；开工前设许可、排风、电力、给排水 </w:t>
-      </w:r>
-      <w:r>
-        <w:rPr>
-          <w:rFonts w:ascii="Times New Roman" w:cs="Times New Roman" w:eastAsia="Microsoft YaHei" w:hAnsi="Times New Roman"/>
-          <w:b/>
-          <w:bCs/>
-          <w:i w:val="false"/>
-          <w:iCs w:val="false"/>
-          <w:color w:val="151515"/>
-          <w:sz w:val="19"/>
-          <w:szCs w:val="19"/>
-        </w:rPr>
-        <w:t xml:space="preserve">4 道核验门槛</w:t>
-      </w:r>
-      <w:r>
-        <w:rPr>
-          <w:rFonts w:ascii="Times New Roman" w:cs="Times New Roman" w:eastAsia="Microsoft YaHei" w:hAnsi="Times New Roman"/>
-          <w:b w:val="false"/>
-          <w:bCs w:val="false"/>
-          <w:i w:val="false"/>
-          <w:iCs w:val="false"/>
-          <w:color w:val="151515"/>
-          <w:sz w:val="19"/>
-          <w:szCs w:val="19"/>
-        </w:rPr>
-        <w:t xml:space="preserve">，导视按反馈迭代 </w:t>
+        <w:t xml:space="preserve">AI 勘测与设计：</w:t>
+      </w:r>
+      <w:r>
+        <w:rPr>
+          <w:rFonts w:ascii="Times New Roman" w:cs="Times New Roman" w:eastAsia="Microsoft YaHei" w:hAnsi="Times New Roman"/>
+          <w:b w:val="false"/>
+          <w:bCs w:val="false"/>
+          <w:i w:val="false"/>
+          <w:iCs w:val="false"/>
+          <w:color w:val="151515"/>
+          <w:sz w:val="19"/>
+          <w:szCs w:val="19"/>
+        </w:rPr>
+        <w:t xml:space="preserve">现场视频抽帧交 AI 识别排风、尺寸等约束，完成商超档口</w:t>
+      </w:r>
+      <w:r>
+        <w:rPr>
+          <w:rFonts w:ascii="Times New Roman" w:cs="Times New Roman" w:eastAsia="Microsoft YaHei" w:hAnsi="Times New Roman"/>
+          <w:b/>
+          <w:bCs/>
+          <w:i w:val="false"/>
+          <w:iCs w:val="false"/>
+          <w:color w:val="151515"/>
+          <w:sz w:val="19"/>
+          <w:szCs w:val="19"/>
+        </w:rPr>
+        <w:t xml:space="preserve">动线设计</w:t>
+      </w:r>
+      <w:r>
+        <w:rPr>
+          <w:rFonts w:ascii="Times New Roman" w:cs="Times New Roman" w:eastAsia="Microsoft YaHei" w:hAnsi="Times New Roman"/>
+          <w:b w:val="false"/>
+          <w:bCs w:val="false"/>
+          <w:i w:val="false"/>
+          <w:iCs w:val="false"/>
+          <w:color w:val="151515"/>
+          <w:sz w:val="19"/>
+          <w:szCs w:val="19"/>
+        </w:rPr>
+        <w:t xml:space="preserve">；借助 AI 完成 Logo、门店效果图、导视（迭代 </w:t>
       </w:r>
       <w:r>
         <w:rPr>
@@ -4496,7 +4496,7 @@
           <w:sz w:val="19"/>
           <w:szCs w:val="19"/>
         </w:rPr>
-        <w:t xml:space="preserve">。</w:t>
+        <w:t xml:space="preserve">）与品牌推广方案。</w:t>
       </w:r>
     </w:p>
     <w:p>
@@ -4519,72 +4519,134 @@
           <w:sz w:val="19"/>
           <w:szCs w:val="19"/>
         </w:rPr>
-        <w:t xml:space="preserve">落地与运营：</w:t>
-      </w:r>
-      <w:r>
-        <w:rPr>
-          <w:rFonts w:ascii="Times New Roman" w:cs="Times New Roman" w:eastAsia="Microsoft YaHei" w:hAnsi="Times New Roman"/>
-          <w:b w:val="false"/>
-          <w:bCs w:val="false"/>
-          <w:i w:val="false"/>
-          <w:iCs w:val="false"/>
-          <w:color w:val="151515"/>
-          <w:sz w:val="19"/>
-          <w:szCs w:val="19"/>
-        </w:rPr>
-        <w:t xml:space="preserve">制定三家同规格比价与施工</w:t>
-      </w:r>
-      <w:r>
-        <w:rPr>
-          <w:rFonts w:ascii="Times New Roman" w:cs="Times New Roman" w:eastAsia="Times New Roman" w:hAnsi="Times New Roman"/>
-          <w:b w:val="false"/>
-          <w:bCs w:val="false"/>
-          <w:i w:val="false"/>
-          <w:iCs w:val="false"/>
-          <w:color w:val="151515"/>
-          <w:sz w:val="19"/>
-          <w:szCs w:val="19"/>
-        </w:rPr>
-        <w:t xml:space="preserve">—</w:t>
-      </w:r>
-      <w:r>
-        <w:rPr>
-          <w:rFonts w:ascii="Times New Roman" w:cs="Times New Roman" w:eastAsia="Microsoft YaHei" w:hAnsi="Times New Roman"/>
-          <w:b w:val="false"/>
-          <w:bCs w:val="false"/>
-          <w:i w:val="false"/>
-          <w:iCs w:val="false"/>
-          <w:color w:val="151515"/>
-          <w:sz w:val="19"/>
-          <w:szCs w:val="19"/>
-        </w:rPr>
-        <w:t xml:space="preserve">联调</w:t>
-      </w:r>
-      <w:r>
-        <w:rPr>
-          <w:rFonts w:ascii="Times New Roman" w:cs="Times New Roman" w:eastAsia="Times New Roman" w:hAnsi="Times New Roman"/>
-          <w:b w:val="false"/>
-          <w:bCs w:val="false"/>
-          <w:i w:val="false"/>
-          <w:iCs w:val="false"/>
-          <w:color w:val="151515"/>
-          <w:sz w:val="19"/>
-          <w:szCs w:val="19"/>
-        </w:rPr>
-        <w:t xml:space="preserve">—</w:t>
-      </w:r>
-      <w:r>
-        <w:rPr>
-          <w:rFonts w:ascii="Times New Roman" w:cs="Times New Roman" w:eastAsia="Microsoft YaHei" w:hAnsi="Times New Roman"/>
-          <w:b w:val="false"/>
-          <w:bCs w:val="false"/>
-          <w:i w:val="false"/>
-          <w:iCs w:val="false"/>
-          <w:color w:val="151515"/>
-          <w:sz w:val="19"/>
-          <w:szCs w:val="19"/>
-        </w:rPr>
-        <w:t xml:space="preserve">热态测试计划；设计门店日报口径（SKU 销量、成本、报损、现金差异）。</w:t>
+        <w:t xml:space="preserve">AI 工作流：</w:t>
+      </w:r>
+      <w:r>
+        <w:rPr>
+          <w:rFonts w:ascii="Times New Roman" w:cs="Times New Roman" w:eastAsia="Microsoft YaHei" w:hAnsi="Times New Roman"/>
+          <w:b w:val="false"/>
+          <w:bCs w:val="false"/>
+          <w:i w:val="false"/>
+          <w:iCs w:val="false"/>
+          <w:color w:val="151515"/>
+          <w:sz w:val="19"/>
+          <w:szCs w:val="19"/>
+        </w:rPr>
+        <w:t xml:space="preserve">用 </w:t>
+      </w:r>
+      <w:r>
+        <w:rPr>
+          <w:rFonts w:ascii="Times New Roman" w:cs="Times New Roman" w:eastAsia="Microsoft YaHei" w:hAnsi="Times New Roman"/>
+          <w:b/>
+          <w:bCs/>
+          <w:i w:val="false"/>
+          <w:iCs w:val="false"/>
+          <w:color w:val="151515"/>
+          <w:sz w:val="19"/>
+          <w:szCs w:val="19"/>
+        </w:rPr>
+        <w:t xml:space="preserve">Codex</w:t>
+      </w:r>
+      <w:r>
+        <w:rPr>
+          <w:rFonts w:ascii="Times New Roman" w:cs="Times New Roman" w:eastAsia="Microsoft YaHei" w:hAnsi="Times New Roman"/>
+          <w:b w:val="false"/>
+          <w:bCs w:val="false"/>
+          <w:i w:val="false"/>
+          <w:iCs w:val="false"/>
+          <w:color w:val="151515"/>
+          <w:sz w:val="19"/>
+          <w:szCs w:val="19"/>
+        </w:rPr>
+        <w:t xml:space="preserve"> 搭项目工作区，AGENTS.md 定执行规则、项目记忆作事实基线，外发与付款须人工确认；AI 脚本生成施工与采购清单。</w:t>
+      </w:r>
+    </w:p>
+    <w:p>
+      <w:pPr>
+        <w:pStyle w:val="ListParagraph"/>
+        <w:numPr>
+          <w:ilvl w:val="0"/>
+          <w:numId w:val="2"/>
+        </w:numPr>
+        <w:spacing w:line="244" w:lineRule="exact"/>
+      </w:pPr>
+      <w:r>
+        <w:rPr>
+          <w:rFonts w:ascii="Times New Roman" w:cs="Times New Roman" w:eastAsia="Microsoft YaHei" w:hAnsi="Times New Roman"/>
+          <w:b/>
+          <w:bCs/>
+          <w:i w:val="false"/>
+          <w:iCs w:val="false"/>
+          <w:color w:val="151515"/>
+          <w:sz w:val="19"/>
+          <w:szCs w:val="19"/>
+        </w:rPr>
+        <w:t xml:space="preserve">落地与结果：</w:t>
+      </w:r>
+      <w:r>
+        <w:rPr>
+          <w:rFonts w:ascii="Times New Roman" w:cs="Times New Roman" w:eastAsia="Microsoft YaHei" w:hAnsi="Times New Roman"/>
+          <w:b w:val="false"/>
+          <w:bCs w:val="false"/>
+          <w:i w:val="false"/>
+          <w:iCs w:val="false"/>
+          <w:color w:val="151515"/>
+          <w:sz w:val="19"/>
+          <w:szCs w:val="19"/>
+        </w:rPr>
+        <w:t xml:space="preserve">开工前设 </w:t>
+      </w:r>
+      <w:r>
+        <w:rPr>
+          <w:rFonts w:ascii="Times New Roman" w:cs="Times New Roman" w:eastAsia="Microsoft YaHei" w:hAnsi="Times New Roman"/>
+          <w:b/>
+          <w:bCs/>
+          <w:i w:val="false"/>
+          <w:iCs w:val="false"/>
+          <w:color w:val="151515"/>
+          <w:sz w:val="19"/>
+          <w:szCs w:val="19"/>
+        </w:rPr>
+        <w:t xml:space="preserve">4 道核验门槛</w:t>
+      </w:r>
+      <w:r>
+        <w:rPr>
+          <w:rFonts w:ascii="Times New Roman" w:cs="Times New Roman" w:eastAsia="Microsoft YaHei" w:hAnsi="Times New Roman"/>
+          <w:b w:val="false"/>
+          <w:bCs w:val="false"/>
+          <w:i w:val="false"/>
+          <w:iCs w:val="false"/>
+          <w:color w:val="151515"/>
+          <w:sz w:val="19"/>
+          <w:szCs w:val="19"/>
+        </w:rPr>
+        <w:t xml:space="preserve">，设计门店日报口径（SKU 销量、成本、报损）；经持续调整，</w:t>
+      </w:r>
+      <w:r>
+        <w:rPr>
+          <w:rFonts w:ascii="Times New Roman" w:cs="Times New Roman" w:eastAsia="Microsoft YaHei" w:hAnsi="Times New Roman"/>
+          <w:b/>
+          <w:bCs/>
+          <w:i w:val="false"/>
+          <w:iCs w:val="false"/>
+          <w:color w:val="151515"/>
+          <w:sz w:val="19"/>
+          <w:szCs w:val="19"/>
+        </w:rPr>
+        <w:t xml:space="preserve">门店销量显著提升</w:t>
+      </w:r>
+      <w:r>
+        <w:rPr>
+          <w:rFonts w:ascii="Times New Roman" w:cs="Times New Roman" w:eastAsia="Microsoft YaHei" w:hAnsi="Times New Roman"/>
+          <w:b w:val="false"/>
+          <w:bCs w:val="false"/>
+          <w:i w:val="false"/>
+          <w:iCs w:val="false"/>
+          <w:color w:val="151515"/>
+          <w:sz w:val="19"/>
+          <w:szCs w:val="19"/>
+        </w:rPr>
+        <w:t xml:space="preserve">。</w:t>
       </w:r>
     </w:p>
     <w:p>
@@ -4741,7 +4803,7 @@
         </w:rPr>
         <w:t xml:space="preserve">	</w:t>
       </w:r>
-      <w:hyperlink w:history="1" r:id="rIdvvefivitoopqw25mpnvan">
+      <w:hyperlink w:history="1" r:id="rIdhyr6v6nmrkpwl19ollp1p">
         <w:r>
           <w:rPr>
             <w:rFonts w:ascii="Times New Roman" w:cs="Times New Roman" w:eastAsia="Microsoft YaHei" w:hAnsi="Times New Roman"/>
@@ -5105,7 +5167,7 @@
           <w:sz w:val="19"/>
           <w:szCs w:val="19"/>
         </w:rPr>
-        <w:t xml:space="preserve">Python / FastAPI / SQL、API 联调、AWS Serverless 部署与监控；LLM / Agent、RAG、Tool Calling、回归评测。</w:t>
+        <w:t xml:space="preserve">Python / FastAPI / SQL、AWS Serverless 部署与监控；LLM / Agent（Codex）、RAG、OCR 抽取、回归评测。</w:t>
       </w:r>
     </w:p>
     <w:p>

</xml_diff>